<commit_message>
Book 1: replace first edition web build with second edition
Fifteen chapters under new slugs and a five-part structure, plus the new
front door (Ch1, The User Who Left the Room) and Ch14. Old first-edition
URLs kept as canonical + noindex redirect stubs.

- Rebuild all chapter pages from the second-edition manuscript
- Add Tools section to every page sidebar (was landing page only)
- downloads.html: new sidebar, corrected chapter citations (3->4, 4->5, 13->15)
- cost-calculator.html: repoint to ch04, fix canonical
- Agent Candidacy + Channel 2 checklists: field-manual ref 13 -> 15
- Channel 2 checklist: add the three items the book lists and the template
  omitted (observability at the decision moment, environmental reversion,
  apprenticeship pipeline)
- Hub index.html: Book 1 subtitle, fifteen chapters, new preface URL, bio
</commit_message>
<xml_diff>
--- a/book3/downloads/Channel-2-Launch-Checklist.docx
+++ b/book3/downloads/Channel-2-Launch-Checklist.docx
@@ -24,7 +24,7 @@
     </w:p>
     <w:p>
       <w:r>
-        <w:t>From the field manual (Chapter 13). Check each item before you ship.</w:t>
+        <w:t>From the field manual (Chapter 15). Check each item before you ship.</w:t>
       </w:r>
     </w:p>
     <w:p>
@@ -199,6 +199,93 @@
           <w:sz w:val="20"/>
         </w:rPr>
         <w:t>One person per action type carries the outcome, and that name is in the UI, not only the policy doc.</w:t>
+      </w:r>
+    </w:p>
+    <w:p>
+      <w:r>
+        <w:rPr>
+          <w:color w:val="CCCCCC"/>
+        </w:rPr>
+        <w:t>____________________________________________________________________________________________</w:t>
+      </w:r>
+    </w:p>
+    <w:p/>
+    <w:p>
+      <w:r>
+        <w:rPr>
+          <w:b/>
+          <w:color w:val="1F3864"/>
+          <w:sz w:val="24"/>
+        </w:rPr>
+        <w:t>Observability, lineage, and transparency at the decision moment</w:t>
+      </w:r>
+    </w:p>
+    <w:p>
+      <w:r>
+        <w:rPr>
+          <w:i/>
+          <w:color w:val="666666"/>
+          <w:sz w:val="20"/>
+        </w:rPr>
+        <w:t>Observability, data lineage, and model transparency are available to the supervisor when the decision is made, not afterwards.</w:t>
+      </w:r>
+    </w:p>
+    <w:p>
+      <w:r>
+        <w:rPr>
+          <w:color w:val="CCCCCC"/>
+        </w:rPr>
+        <w:t>____________________________________________________________________________________________</w:t>
+      </w:r>
+    </w:p>
+    <w:p/>
+    <w:p>
+      <w:r>
+        <w:rPr>
+          <w:b/>
+          <w:color w:val="1F3864"/>
+          <w:sz w:val="24"/>
+        </w:rPr>
+        <w:t>Environmental reversion risk assessed</w:t>
+      </w:r>
+    </w:p>
+    <w:p>
+      <w:r>
+        <w:rPr>
+          <w:i/>
+          <w:color w:val="666666"/>
+          <w:sz w:val="20"/>
+        </w:rPr>
+        <w:t>Which conditions must the product import from the structured setting to the production environment to hold the supervisory behavior stable?</w:t>
+      </w:r>
+    </w:p>
+    <w:p>
+      <w:r>
+        <w:rPr>
+          <w:color w:val="CCCCCC"/>
+        </w:rPr>
+        <w:t>____________________________________________________________________________________________</w:t>
+      </w:r>
+    </w:p>
+    <w:p/>
+    <w:p>
+      <w:r>
+        <w:rPr>
+          <w:b/>
+          <w:color w:val="1F3864"/>
+          <w:sz w:val="24"/>
+        </w:rPr>
+        <w:t>Apprenticeship pipeline considered</w:t>
+      </w:r>
+    </w:p>
+    <w:p>
+      <w:r>
+        <w:rPr>
+          <w:i/>
+          <w:color w:val="666666"/>
+          <w:sz w:val="20"/>
+        </w:rPr>
+        <w:t>How will the next generation of supervisors build the judgment the agent is about to remove from the work?</w:t>
       </w:r>
     </w:p>
     <w:p>

</xml_diff>